<commit_message>
Spanish Part 4: episodes 43-45; align kiln 1 status (old, half-running) in ep47/ep52
Co-Authored-By: Claude Opus 5.5 <noreply@anthropic.com>
Claude-Session: https://claude.ai/code/session_014Pwa4fJotSRvNewqVrvk7U
</commit_message>
<xml_diff>
--- a/business_es/part4/ep47_Faisal_Al_Harbi.docx
+++ b/business_es/part4/ep47_Faisal_Al_Harbi.docx
@@ -2087,7 +2087,7 @@
           <w:sz w:val="22"/>
         </w:rPr>
         <w:tab/>
-        <w:t>Sí, con dos condiciones que están en la oferta. Primera: rehabilitar nuestro horno uno, parado desde hace años. El presupuesto es de ochocientos cincuenta mil euros y seis semanas de obra. Segunda: un vecino de Onda, Cerámicas Monfort, fabricaría hasta tres mil metros al mes bajo nuestro control de calidad.</w:t>
+        <w:t>Sí, con dos condiciones que están en la oferta. Primera: rehabilitar nuestro horno uno, el más antiguo, que hoy trabaja a medio gas con formatos pequeños. El presupuesto es de ochocientos cincuenta mil euros y seis semanas de obra. Segunda: un vecino de Onda, Cerámicas Monfort, fabricaría hasta tres mil metros al mes bajo nuestro control de calidad.</w:t>
       </w:r>
     </w:p>
     <w:p>
@@ -8892,7 +8892,7 @@
           <w:sz w:val="21"/>
         </w:rPr>
         <w:tab/>
-        <w:t>네, 응찰서에 적은 두 가지 조건으로요. 첫째, 몇 년째 멈춰 있는 1호기를 개보수하는 것입니다. 견적은 85만 유로, 공사 6주입니다. 둘째, 온다의 이웃 회사인 세라미카스 몬포르트가 저희 품질관리 아래 한 달에 최대 3천㎡를 생산합니다.</w:t>
+        <w:t>네, 응찰서에 적은 두 가지 조건으로요. 첫째, 지금은 소형 규격으로 절반만 돌고 있는 가장 오래된 1호기를 개보수하는 것입니다. 견적은 85만 유로, 공사 6주입니다. 둘째, 온다의 이웃 회사인 세라미카스 몬포르트가 저희 품질관리 아래 한 달에 최대 3천㎡를 생산합니다.</w:t>
       </w:r>
     </w:p>
     <w:p>

</xml_diff>